<commit_message>
rework(m48): fichas, manifest e informe al contrato 43/44 (modelo-47 con xai_result / xai_error)
</commit_message>
<xml_diff>
--- a/outputs/a48/a48_ficha_funcional.docx
+++ b/outputs/a48/a48_ficha_funcional.docx
@@ -468,7 +468,7 @@
           </w:tcPr>
           <w:p ns2:paraId="4F17D729" ns2:textId="77777777">
             <w:r>
-              <w:t xml:space="preserve">Red convolucional 1D multitarea con pérdida físico-informada (DNSL) que diagnostica el estado de cuatro componentes de un pasteurizador (enfriador, válvula, bomba y acumulador) a partir de un ciclo de 60 s de siete sensores a 10 Hz, y añade explicabilidad integrada: ventanas temporales críticas (Grad-CAM), importancia por sensor (SHAP opcional), puntos críticos de control (CCP) y acciones de mantenimiento priorizadas.</w:t>
+              <w:t xml:space="preserve">Modelo que sirve modelo-47 (detección de fallos en pasteurización con XAI integrada): red convolucional 1D multitarea con pérdida físico-informada (DNSL) que diagnostica el estado de cuatro componentes de un pasteurizador (enfriador, válvula, bomba y acumulador) a partir de un ciclo de 60 s de siete sensores a 10 Hz, y añade explicabilidad integrada: ventanas temporales críticas (Grad-CAM), importancia por sensor (SHAP opcional), riesgo por componente y acciones de mantenimiento priorizadas.</w:t>
             </w:r>
           </w:p>
         </w:tc>
@@ -523,7 +523,7 @@
           </w:tcPr>
           <w:p ns2:paraId="1ED00FCD" ns2:textId="77777777">
             <w:r>
-              <w:t xml:space="preserve">Dotar al diagnóstico de fallos de maquinaria de pasteurizado (Entregable 47) de explicabilidad, diagnóstico causal aproximado y recomendación prescriptiva, de modo que el técnico de planta sepa no solo qué componente degrada, sino cuándo se manifiesta dentro del ciclo, qué sensor domina la decisión y qué acción priorizar. La detección de puntos críticos de control (CCP) se inspira en el paradigma HACCP.</w:t>
+              <w:t xml:space="preserve">Dotar al diagnóstico de fallos de maquinaria de pasteurizado (Entregable 47) de explicabilidad, diagnóstico causal aproximado y recomendación prescriptiva, de modo que el técnico de planta sepa no solo qué componente degrada, sino cuándo se manifiesta dentro del ciclo, qué sensor domina la decisión y qué acción priorizar.</w:t>
             </w:r>
           </w:p>
         </w:tc>
@@ -578,7 +578,7 @@
           </w:tcPr>
           <w:p ns2:paraId="40956F30" ns2:textId="77777777">
             <w:r>
-              <w:t xml:space="preserve">Modo inline: se envía un ciclo de 60 s (siete sensores a 10 Hz) y se obtiene el estado de los cuatro componentes con su confianza y un informe local con la ventana crítica, el riesgo y la acción recomendada por componente; SHAP es opcional. Modo batch: se envía un CSV con varios ciclos (Cycle_ID) y, con include_xai, se obtiene además el análisis global de CCP sobre una muestra de ciclos.</w:t>
+              <w:t xml:space="preserve">Modo inline: se envía un ciclo de 60 s (siete sensores a 10 Hz) y se obtiene el estado de los cuatro componentes con su confianza y su xai_result (estado del sistema, componentes alterados, variables clave y acciones, con la ventana crítica y el riesgo por componente); SHAP es opcional. Modo batch: se envía un CSV con varios ciclos (Cycle_ID) y cada fila devuelve su predicción y su propio xai_result o xai_error.</w:t>
             </w:r>
           </w:p>
         </w:tc>
@@ -1292,7 +1292,7 @@
           </w:tcPr>
           <w:p ns2:paraId="3AB481B3" ns2:textId="77777777">
             <w:r>
-              <w:t xml:space="preserve">Inline: informe local por componente (ventana Grad-CAM, riesgo, acción). Batch: análisis global de puntos críticos (CCP)</w:t>
+              <w:t xml:space="preserve">XAI de cada ciclo (xai_result / xai_error): Grad-CAM, riesgo y acciones. Inline y batch</w:t>
             </w:r>
           </w:p>
         </w:tc>
@@ -1340,7 +1340,7 @@
           </w:tcPr>
           <w:p ns2:paraId="3AB481B3" ns2:textId="77777777">
             <w:r>
-              <w:t xml:space="preserve">Añade SHAP (sensor más relevante e importancias). Requiere include_xai; coste alto en CPU</w:t>
+              <w:t xml:space="preserve">Añade SHAP (sensor más relevante) a la XAI. Requiere include_xai; coste alto en CPU. En batch solo se calcula en los primeros n_samples ciclos</w:t>
             </w:r>
           </w:p>
         </w:tc>
@@ -1436,7 +1436,7 @@
           </w:tcPr>
           <w:p ns2:paraId="3AB481B3" ns2:textId="77777777">
             <w:r>
-              <w:t xml:space="preserve">Batch con XAI: ciclos máximos del CSV usados en el análisis global (muestra aleatoria, semilla 42)</w:t>
+              <w:t xml:space="preserve">Batch con include_shap: ciclos máximos con SHAP (el resto lleva solo Grad-CAM, siempre presente en todos los ciclos)</w:t>
             </w:r>
           </w:p>
         </w:tc>
@@ -1968,7 +1968,7 @@
           </w:tcPr>
           <w:p ns2:paraId="2CD654FD" ns2:textId="77777777">
             <w:r>
-              <w:t xml:space="preserve">xai (inline)</w:t>
+              <w:t xml:space="preserve">xai_result</w:t>
             </w:r>
           </w:p>
         </w:tc>
@@ -1991,7 +1991,7 @@
           </w:tcPr>
           <w:p ns2:paraId="35872DC0" ns2:textId="77777777">
             <w:r>
-              <w:t xml:space="preserve">Por componente: ventana crítica Grad-CAM en segundos (inicio/fin), intensidad, acción, urgencia, intervalo de ciclos, riesgo_score/nivel y, con SHAP, sensor más relevante e importancia</w:t>
+              <w:t xml:space="preserve">XAI del ciclo (inline: en la respuesta; batch: en cada fila). Mismo contrato que modelo-43: Estado_del_sistema.Estado_interpretativo, Bloques_principales, Variables_clave, Acciones_sugeridas / Mensaje_operativo y Detalle_componentes (ventana crítica Grad-CAM, riesgo, acción, sensor SHAP)</w:t>
             </w:r>
           </w:p>
         </w:tc>
@@ -2014,7 +2014,7 @@
           </w:tcPr>
           <w:p ns2:paraId="1DF2EF4D" ns2:textId="77777777">
             <w:r>
-              <w:t xml:space="preserve">riesgo_score = severidad × confianza (con bonus SHAP si se pide); NORMAL &lt; 0,5 ≤ WARNING &lt; 0,8 ≤ CRÍTICO</w:t>
+              <w:t xml:space="preserve">Estado = peor estado de los 4 componentes (Normal / Warning / Crítico); Bloques = componentes alterados; Variables = sensores de la regla física (y el sensor SHAP si se pidió); Acciones = acciones prescriptivas por urgencia</w:t>
             </w:r>
           </w:p>
         </w:tc>
@@ -2039,7 +2039,7 @@
           </w:tcPr>
           <w:p ns2:paraId="2CD654FD" ns2:textId="77777777">
             <w:r>
-              <w:t xml:space="preserve">xai (batch)</w:t>
+              <w:t xml:space="preserve">xai_error</w:t>
             </w:r>
           </w:p>
         </w:tc>
@@ -2062,7 +2062,7 @@
           </w:tcPr>
           <w:p ns2:paraId="35872DC0" ns2:textId="77777777">
             <w:r>
-              <w:t xml:space="preserve">ccps (ventanas críticas por componente, sensor, regla física, severidad agregada), shap (importancia por componente y sensor, 28 filas) y summary (ciclos analizados)</w:t>
+              <w:t xml:space="preserve">Motivo si la XAI de ese ciclo falló (xai_result es null); null si fue correcta</w:t>
             </w:r>
           </w:p>
         </w:tc>
@@ -2085,7 +2085,7 @@
           </w:tcPr>
           <w:p ns2:paraId="1DF2EF4D" ns2:textId="77777777">
             <w:r>
-              <w:t xml:space="preserve">severidad CRÍTICO si &gt;10 % de ciclos son Crítico; WARNING si &gt;20 % son Warning</w:t>
+              <w:t xml:space="preserve">un fallo de XAI no afecta a la predicción del ciclo ni a la de los demás ciclos del lote</w:t>
             </w:r>
           </w:p>
         </w:tc>
@@ -2131,7 +2131,7 @@
         <w:jc w:val="both"/>
       </w:pPr>
       <w:r>
-        <w:t xml:space="preserve">Si para un ciclo el enfriador sale como «Crítico» con una confianza del 96 %, la ventana crítica va de los segundos 9,1 a 11,1 y la acción es «Detener producción y ejecutar limpieza CIP inmediata», debes parar y limpiar; si válvula, bomba y acumulador salen «Sano», no requieren intervención en ese ciclo.</w:t>
+        <w:t xml:space="preserve">Si para un ciclo el estado del sistema sale «Crítico» porque el enfriador está en «Crítico» con una confianza del 96 %, la acción sugerida es «Fouling: Detener producción y ejecutar limpieza CIP inmediata», debes parar y limpiar; si válvula, bomba y acumulador salen «Sano», no requieren intervención en ese ciclo.</w:t>
       </w:r>
     </w:p>
     <w:p ns2:paraId="7585C801" ns2:textId="77777777">
@@ -2948,7 +2948,7 @@
           </w:tcPr>
           <w:p ns2:paraId="3FD46393" ns2:textId="77777777">
             <w:r>
-              <w:t xml:space="preserve">SHAP (GradientExplainer) cuesta ≈5–8 s por ciclo en CPU y ≈10 min en el análisis global de 50 ciclos, por eso es opcional. Sus valores dependen de la versión de shap: se reproducen con shap ≥ 0,51 (verificado 0,52.0), no con 0,42.</w:t>
+              <w:t xml:space="preserve">SHAP (GradientExplainer) cuesta ≈5–8 s por ciclo en CPU, por eso es opcional y en batch se limita a los primeros n_samples ciclos (el resto lleva solo Grad-CAM). Sus valores dependen de la versión de shap: se reproducen con shap ≥ 0,51 (verificado 0,52.0), no con 0,42.</w:t>
             </w:r>
           </w:p>
         </w:tc>

</xml_diff>